<commit_message>
October 2026 Refresh of the website.
</commit_message>
<xml_diff>
--- a/survey-descriptions.docx
+++ b/survey-descriptions.docx
@@ -1,6 +1,6 @@
 
 <file path=word/document.xml><?xml version="1.0" encoding="utf-8"?>
-<w:document xmlns:wpc="http://schemas.microsoft.com/office/word/2010/wordprocessingCanvas" xmlns:cx="http://schemas.microsoft.com/office/drawing/2014/chartex" xmlns:cx1="http://schemas.microsoft.com/office/drawing/2015/9/8/chartex" xmlns:cx2="http://schemas.microsoft.com/office/drawing/2015/10/21/chartex" xmlns:cx3="http://schemas.microsoft.com/office/drawing/2016/5/9/chartex" xmlns:cx4="http://schemas.microsoft.com/office/drawing/2016/5/10/chartex" xmlns:cx5="http://schemas.microsoft.com/office/drawing/2016/5/11/chartex" xmlns:cx6="http://schemas.microsoft.com/office/drawing/2016/5/12/chartex" xmlns:cx7="http://schemas.microsoft.com/office/drawing/2016/5/13/chartex" xmlns:cx8="http://schemas.microsoft.com/office/drawing/2016/5/14/chartex" xmlns:mc="http://schemas.openxmlformats.org/markup-compatibility/2006" xmlns:aink="http://schemas.microsoft.com/office/drawing/2016/ink" xmlns:am3d="http://schemas.microsoft.com/office/drawing/2017/model3d" xmlns:o="urn:schemas-microsoft-com:office:office" xmlns:oel="http://schemas.microsoft.com/office/2019/extlst" xmlns:r="http://schemas.openxmlformats.org/officeDocument/2006/relationships" xmlns:m="http://schemas.openxmlformats.org/officeDocument/2006/math" xmlns:v="urn:schemas-microsoft-com:vml" xmlns:wp14="http://schemas.microsoft.com/office/word/2010/wordprocessingDrawing" xmlns:wp="http://schemas.openxmlformats.org/drawingml/2006/wordprocessingDrawing" xmlns:w10="urn:schemas-microsoft-com:office:word" xmlns:w="http://schemas.openxmlformats.org/wordprocessingml/2006/main" xmlns:w14="http://schemas.microsoft.com/office/word/2010/wordml" xmlns:w15="http://schemas.microsoft.com/office/word/2012/wordml" xmlns:w16cex="http://schemas.microsoft.com/office/word/2018/wordml/cex" xmlns:w16cid="http://schemas.microsoft.com/office/word/2016/wordml/cid" xmlns:w16="http://schemas.microsoft.com/office/word/2018/wordml" xmlns:w16du="http://schemas.microsoft.com/office/word/2023/wordml/word16du" xmlns:w16sdtdh="http://schemas.microsoft.com/office/word/2020/wordml/sdtdatahash" xmlns:w16sdtfl="http://schemas.microsoft.com/office/word/2024/wordml/sdtformatlock" xmlns:w16se="http://schemas.microsoft.com/office/word/2015/wordml/symex" xmlns:wpg="http://schemas.microsoft.com/office/word/2010/wordprocessingGroup" xmlns:wpi="http://schemas.microsoft.com/office/word/2010/wordprocessingInk" xmlns:wne="http://schemas.microsoft.com/office/word/2006/wordml" xmlns:wps="http://schemas.microsoft.com/office/word/2010/wordprocessingShape" mc:Ignorable="w14 w15 w16se w16cid w16 w16cex w16sdtdh w16sdtfl w16du wp14">
+<w:document xmlns:wpc="http://schemas.microsoft.com/office/word/2010/wordprocessingCanvas" xmlns:cx="http://schemas.microsoft.com/office/drawing/2014/chartex" xmlns:cx1="http://schemas.microsoft.com/office/drawing/2015/9/8/chartex" xmlns:cx2="http://schemas.microsoft.com/office/drawing/2015/10/21/chartex" xmlns:cx3="http://schemas.microsoft.com/office/drawing/2016/5/9/chartex" xmlns:cx4="http://schemas.microsoft.com/office/drawing/2016/5/10/chartex" xmlns:cx5="http://schemas.microsoft.com/office/drawing/2016/5/11/chartex" xmlns:cx6="http://schemas.microsoft.com/office/drawing/2016/5/12/chartex" xmlns:cx7="http://schemas.microsoft.com/office/drawing/2016/5/13/chartex" xmlns:cx8="http://schemas.microsoft.com/office/drawing/2016/5/14/chartex" xmlns:mc="http://schemas.openxmlformats.org/markup-compatibility/2006" xmlns:m="http://schemas.openxmlformats.org/officeDocument/2006/math" xmlns:aink="http://schemas.microsoft.com/office/drawing/2016/ink" xmlns:am3d="http://schemas.microsoft.com/office/drawing/2017/model3d" xmlns:oel="http://schemas.microsoft.com/office/2019/extlst" xmlns:r="http://schemas.openxmlformats.org/officeDocument/2006/relationships" xmlns:wp14="http://schemas.microsoft.com/office/word/2010/wordprocessingDrawing" xmlns:wp="http://schemas.openxmlformats.org/drawingml/2006/wordprocessingDrawing" xmlns:wpg="http://schemas.microsoft.com/office/word/2010/wordprocessingGroup" xmlns:wpi="http://schemas.microsoft.com/office/word/2010/wordprocessingInk" xmlns:wps="http://schemas.microsoft.com/office/word/2010/wordprocessingShape" xmlns:o="urn:schemas-microsoft-com:office:office" xmlns:v="urn:schemas-microsoft-com:vml" xmlns:w10="urn:schemas-microsoft-com:office:word" xmlns:w="http://schemas.openxmlformats.org/wordprocessingml/2006/main" xmlns:w14="http://schemas.microsoft.com/office/word/2010/wordml" xmlns:w15="http://schemas.microsoft.com/office/word/2012/wordml" xmlns:w16cex="http://schemas.microsoft.com/office/word/2018/wordml/cex" xmlns:w16cid="http://schemas.microsoft.com/office/word/2016/wordml/cid" xmlns:w16="http://schemas.microsoft.com/office/word/2018/wordml" xmlns:w16sdtdh="http://schemas.microsoft.com/office/word/2020/wordml/sdtdatahash" xmlns:w16sdtfl="http://schemas.microsoft.com/office/word/2024/wordml/sdtformatlock" xmlns:w16se="http://schemas.microsoft.com/office/word/2015/wordml/symex" xmlns:w16du="http://schemas.microsoft.com/office/word/2023/wordml/word16du" xmlns:wne="http://schemas.microsoft.com/office/word/2006/wordml" mc:Ignorable="w14 w15 w16se w16cid w16 w16cex w16sdtdh w16sdtfl w16du wp14">
   <w:body>
     <w:p>
       <w:pPr>
@@ -23,21 +23,7 @@
           <w:rFonts w:ascii="Arial" w:hAnsi="Arial" w:cs="Arial"/>
           <w:color w:val="000000"/>
         </w:rPr>
-        <w:t xml:space="preserve"> is a monthly online survey of CEOs, CFOs and senior executives at US firms</w:t>
-      </w:r>
-      <w:r>
-        <w:rPr>
-          <w:rFonts w:ascii="Arial" w:hAnsi="Arial" w:cs="Arial"/>
-          <w:color w:val="000000"/>
-        </w:rPr>
-        <w:t>. It was launched in 2014 and is</w:t>
-      </w:r>
-      <w:r>
-        <w:rPr>
-          <w:rFonts w:ascii="Arial" w:hAnsi="Arial" w:cs="Arial"/>
-          <w:color w:val="000000"/>
-        </w:rPr>
-        <w:t xml:space="preserve"> run by the Federal Reserve Bank of Atlanta.</w:t>
+        <w:t xml:space="preserve"> is a monthly online survey of CEOs, CFOs and senior executives at US firms. It was launched in 2014 and is run by the Federal Reserve Bank of Atlanta.</w:t>
       </w:r>
     </w:p>
     <w:p>
@@ -69,21 +55,7 @@
           <w:rFonts w:ascii="Arial" w:hAnsi="Arial" w:cs="Arial"/>
           <w:color w:val="000000"/>
         </w:rPr>
-        <w:t xml:space="preserve"> is a monthly, online survey of UK businesses.</w:t>
-      </w:r>
-      <w:r>
-        <w:rPr>
-          <w:rFonts w:ascii="Arial" w:hAnsi="Arial" w:cs="Arial"/>
-          <w:color w:val="000000"/>
-        </w:rPr>
-        <w:t xml:space="preserve"> </w:t>
-      </w:r>
-      <w:r>
-        <w:rPr>
-          <w:rFonts w:ascii="Arial" w:hAnsi="Arial" w:cs="Arial"/>
-          <w:color w:val="000000"/>
-        </w:rPr>
-        <w:t>The DMP was launched in 2016 and is run by the Bank of England.</w:t>
+        <w:t xml:space="preserve"> is a monthly, online survey of UK businesses. The DMP was launched in 2016 and is run by the Bank of England.</w:t>
       </w:r>
     </w:p>
     <w:p>
@@ -129,14 +101,7 @@
           <w:rFonts w:ascii="Arial" w:hAnsi="Arial" w:cs="Arial"/>
           <w:color w:val="000000"/>
         </w:rPr>
-        <w:t>is an online survey of a representative panel of firms located in Germany and is run by the Deutsche Bundesbank – Germany’s central bank. The survey was first conducted in June 2020</w:t>
-      </w:r>
-      <w:r>
-        <w:rPr>
-          <w:rFonts w:ascii="Arial" w:hAnsi="Arial" w:cs="Arial"/>
-          <w:color w:val="000000"/>
-        </w:rPr>
-        <w:t xml:space="preserve">. </w:t>
+        <w:t xml:space="preserve">is an online survey of a representative panel of firms located in Germany and is run by the Deutsche Bundesbank – Germany’s central bank. The survey was first conducted in June 2020. </w:t>
       </w:r>
     </w:p>
     <w:p>
@@ -151,6 +116,7 @@
       <w:pPr>
         <w:rPr>
           <w:rFonts w:ascii="Arial" w:hAnsi="Arial" w:cs="Arial"/>
+          <w:color w:val="000000"/>
         </w:rPr>
       </w:pPr>
       <w:hyperlink r:id="rId7" w:history="1">
@@ -167,21 +133,104 @@
           <w:rFonts w:ascii="Arial" w:hAnsi="Arial" w:cs="Arial"/>
           <w:color w:val="000000"/>
         </w:rPr>
-        <w:t xml:space="preserve"> is a monthly, online survey of Australian businesses.</w:t>
+        <w:t xml:space="preserve"> is a monthly, online survey of Australian businesses. It was as established in 2024 by Macquarie University.</w:t>
       </w:r>
+    </w:p>
+    <w:p>
+      <w:pPr>
+        <w:rPr>
+          <w:rFonts w:ascii="Arial" w:hAnsi="Arial" w:cs="Arial"/>
+          <w:color w:val="000000"/>
+        </w:rPr>
+      </w:pPr>
+    </w:p>
+    <w:p>
+      <w:pPr>
+        <w:rPr>
+          <w:rFonts w:ascii="Arial" w:hAnsi="Arial" w:cs="Arial"/>
+          <w:color w:val="000000"/>
+        </w:rPr>
+      </w:pPr>
       <w:r>
         <w:rPr>
           <w:rFonts w:ascii="Arial" w:hAnsi="Arial" w:cs="Arial"/>
           <w:color w:val="000000"/>
         </w:rPr>
-        <w:t xml:space="preserve"> It was </w:t>
+        <w:t xml:space="preserve">The </w:t>
       </w:r>
+      <w:hyperlink r:id="rId8" w:history="1">
+        <w:r>
+          <w:rPr>
+            <w:rStyle w:val="Hyperlink"/>
+            <w:rFonts w:ascii="Arial" w:hAnsi="Arial" w:cs="Arial"/>
+          </w:rPr>
+          <w:t>Business Leaders’ Pulse (BLP)</w:t>
+        </w:r>
+      </w:hyperlink>
       <w:r>
         <w:rPr>
           <w:rFonts w:ascii="Arial" w:hAnsi="Arial" w:cs="Arial"/>
           <w:color w:val="000000"/>
         </w:rPr>
-        <w:t>as established in 2024 by Macquarie University.</w:t>
+        <w:t xml:space="preserve"> is a monthly online survey of businesses in Canada run by the Bank of Canada. It was established in 2021.</w:t>
+      </w:r>
+    </w:p>
+    <w:p>
+      <w:pPr>
+        <w:rPr>
+          <w:rFonts w:ascii="Arial" w:hAnsi="Arial" w:cs="Arial"/>
+          <w:color w:val="000000"/>
+        </w:rPr>
+      </w:pPr>
+    </w:p>
+    <w:p>
+      <w:pPr>
+        <w:rPr>
+          <w:rFonts w:ascii="Arial" w:hAnsi="Arial" w:cs="Arial"/>
+          <w:color w:val="000000"/>
+        </w:rPr>
+      </w:pPr>
+      <w:r>
+        <w:rPr>
+          <w:rFonts w:ascii="Arial" w:hAnsi="Arial" w:cs="Arial"/>
+          <w:color w:val="000000"/>
+        </w:rPr>
+        <w:t xml:space="preserve">The Monthly Survey on Regional Economic Activity (EMAER) is a monthly representative survey of establishments with more than 100 workers in Mexico. It was established in 2009 and is run by Banco de Mexico. </w:t>
+      </w:r>
+    </w:p>
+    <w:p>
+      <w:pPr>
+        <w:rPr>
+          <w:rFonts w:ascii="Arial" w:hAnsi="Arial" w:cs="Arial"/>
+        </w:rPr>
+      </w:pPr>
+    </w:p>
+    <w:p>
+      <w:pPr>
+        <w:rPr>
+          <w:rFonts w:ascii="Arial" w:hAnsi="Arial" w:cs="Arial"/>
+        </w:rPr>
+      </w:pPr>
+      <w:r>
+        <w:rPr>
+          <w:rFonts w:ascii="Arial" w:hAnsi="Arial" w:cs="Arial"/>
+        </w:rPr>
+        <w:t xml:space="preserve">The </w:t>
+      </w:r>
+      <w:hyperlink r:id="rId9" w:history="1">
+        <w:r>
+          <w:rPr>
+            <w:rStyle w:val="Hyperlink"/>
+            <w:rFonts w:ascii="Arial" w:hAnsi="Arial" w:cs="Arial"/>
+          </w:rPr>
+          <w:t>Quarterly inflation expectations survey</w:t>
+        </w:r>
+      </w:hyperlink>
+      <w:r>
+        <w:rPr>
+          <w:rFonts w:ascii="Arial" w:hAnsi="Arial" w:cs="Arial"/>
+        </w:rPr>
+        <w:t xml:space="preserve"> is conducted by the Bureau for Economic Research on behalf of the South African Reserve Bank. It was established in 2001. </w:t>
       </w:r>
     </w:p>
     <w:sectPr>
@@ -197,7 +246,7 @@
 </file>
 
 <file path=word/styles.xml><?xml version="1.0" encoding="utf-8"?>
-<w:styles xmlns:mc="http://schemas.openxmlformats.org/markup-compatibility/2006" xmlns:r="http://schemas.openxmlformats.org/officeDocument/2006/relationships" xmlns:w="http://schemas.openxmlformats.org/wordprocessingml/2006/main" xmlns:w14="http://schemas.microsoft.com/office/word/2010/wordml" xmlns:w15="http://schemas.microsoft.com/office/word/2012/wordml" xmlns:w16cex="http://schemas.microsoft.com/office/word/2018/wordml/cex" xmlns:w16cid="http://schemas.microsoft.com/office/word/2016/wordml/cid" xmlns:w16="http://schemas.microsoft.com/office/word/2018/wordml" xmlns:w16du="http://schemas.microsoft.com/office/word/2023/wordml/word16du" xmlns:w16sdtdh="http://schemas.microsoft.com/office/word/2020/wordml/sdtdatahash" xmlns:w16sdtfl="http://schemas.microsoft.com/office/word/2024/wordml/sdtformatlock" xmlns:w16se="http://schemas.microsoft.com/office/word/2015/wordml/symex" mc:Ignorable="w14 w15 w16se w16cid w16 w16cex w16sdtdh w16sdtfl w16du">
+<w:styles xmlns:mc="http://schemas.openxmlformats.org/markup-compatibility/2006" xmlns:r="http://schemas.openxmlformats.org/officeDocument/2006/relationships" xmlns:w="http://schemas.openxmlformats.org/wordprocessingml/2006/main" xmlns:w14="http://schemas.microsoft.com/office/word/2010/wordml" xmlns:w15="http://schemas.microsoft.com/office/word/2012/wordml" xmlns:w16cex="http://schemas.microsoft.com/office/word/2018/wordml/cex" xmlns:w16cid="http://schemas.microsoft.com/office/word/2016/wordml/cid" xmlns:w16="http://schemas.microsoft.com/office/word/2018/wordml" xmlns:w16sdtdh="http://schemas.microsoft.com/office/word/2020/wordml/sdtdatahash" xmlns:w16sdtfl="http://schemas.microsoft.com/office/word/2024/wordml/sdtformatlock" xmlns:w16se="http://schemas.microsoft.com/office/word/2015/wordml/symex" xmlns:w16du="http://schemas.microsoft.com/office/word/2023/wordml/word16du" mc:Ignorable="w14 w15 w16se w16cid w16 w16cex w16sdtdh w16sdtfl w16du">
   <w:docDefaults>
     <w:rPrDefault>
       <w:rPr>

</xml_diff>